<commit_message>
fix: Nadia — Inicial Informes no tiene fecha de cierre de períodos
</commit_message>
<xml_diff>
--- a/public/manuales/Manual_Informes_Inicial_2026.docx
+++ b/public/manuales/Manual_Informes_Inicial_2026.docx
@@ -473,7 +473,7 @@
                 <w:sz w:val="18"/>
                 <w:szCs w:val="18"/>
               </w:rPr>
-              <w:t xml:space="preserve">1° Cuatrimestre y 2° Cuatrimestre. Cada período tiene fecha de apertura y cierre.</w:t>
+              <w:t xml:space="preserve">1° Cuatrimestre y 2° Cuatrimestre. Los períodos no tienen fecha de cierre: el docente puede completar o modificar el informe en cualquier momento.</w:t>
             </w:r>
           </w:p>
         </w:tc>
@@ -1038,98 +1038,6 @@
                 <w:szCs w:val="18"/>
               </w:rPr>
               <w:t xml:space="preserve">Directivo / Vicedirector</w:t>
-            </w:r>
-          </w:p>
-        </w:tc>
-      </w:tr>
-      <w:tr>
-        <w:tc>
-          <w:tcPr>
-            <w:tcW w:type="dxa" w:w="1200"/>
-            <w:tcBorders>
-              <w:top w:val="single" w:color="CCCCCC" w:sz="1"/>
-              <w:left w:val="single" w:color="CCCCCC" w:sz="1"/>
-              <w:bottom w:val="single" w:color="CCCCCC" w:sz="1"/>
-              <w:right w:val="single" w:color="CCCCCC" w:sz="1"/>
-            </w:tcBorders>
-            <w:tcMar>
-              <w:top w:type="dxa" w:w="80"/>
-              <w:left w:type="dxa" w:w="120"/>
-              <w:bottom w:type="dxa" w:w="80"/>
-              <w:right w:type="dxa" w:w="120"/>
-            </w:tcMar>
-          </w:tcPr>
-          <w:p>
-            <w:r>
-              <w:rPr>
-                <w:rFonts w:ascii="Archivo" w:cs="Archivo" w:eastAsia="Archivo" w:hAnsi="Archivo"/>
-                <w:b/>
-                <w:bCs/>
-                <w:color w:val="222222"/>
-                <w:sz w:val="18"/>
-                <w:szCs w:val="18"/>
-              </w:rPr>
-              <w:t xml:space="preserve">4</w:t>
-            </w:r>
-          </w:p>
-        </w:tc>
-        <w:tc>
-          <w:tcPr>
-            <w:tcW w:type="dxa" w:w="3626"/>
-            <w:tcBorders>
-              <w:top w:val="single" w:color="CCCCCC" w:sz="1"/>
-              <w:left w:val="single" w:color="CCCCCC" w:sz="1"/>
-              <w:bottom w:val="single" w:color="CCCCCC" w:sz="1"/>
-              <w:right w:val="single" w:color="CCCCCC" w:sz="1"/>
-            </w:tcBorders>
-            <w:tcMar>
-              <w:top w:type="dxa" w:w="80"/>
-              <w:left w:type="dxa" w:w="120"/>
-              <w:bottom w:type="dxa" w:w="80"/>
-              <w:right w:type="dxa" w:w="120"/>
-            </w:tcMar>
-          </w:tcPr>
-          <w:p>
-            <w:r>
-              <w:rPr>
-                <w:rFonts w:ascii="Archivo" w:cs="Archivo" w:eastAsia="Archivo" w:hAnsi="Archivo"/>
-                <w:b w:val="false"/>
-                <w:bCs w:val="false"/>
-                <w:color w:val="222222"/>
-                <w:sz w:val="18"/>
-                <w:szCs w:val="18"/>
-              </w:rPr>
-              <w:t xml:space="preserve">Cierre del período de carga</w:t>
-            </w:r>
-          </w:p>
-        </w:tc>
-        <w:tc>
-          <w:tcPr>
-            <w:tcW w:type="dxa" w:w="4200"/>
-            <w:tcBorders>
-              <w:top w:val="single" w:color="CCCCCC" w:sz="1"/>
-              <w:left w:val="single" w:color="CCCCCC" w:sz="1"/>
-              <w:bottom w:val="single" w:color="CCCCCC" w:sz="1"/>
-              <w:right w:val="single" w:color="CCCCCC" w:sz="1"/>
-            </w:tcBorders>
-            <w:tcMar>
-              <w:top w:type="dxa" w:w="80"/>
-              <w:left w:type="dxa" w:w="120"/>
-              <w:bottom w:type="dxa" w:w="80"/>
-              <w:right w:type="dxa" w:w="120"/>
-            </w:tcMar>
-          </w:tcPr>
-          <w:p>
-            <w:r>
-              <w:rPr>
-                <w:rFonts w:ascii="Archivo" w:cs="Archivo" w:eastAsia="Archivo" w:hAnsi="Archivo"/>
-                <w:b w:val="false"/>
-                <w:bCs w:val="false"/>
-                <w:color w:val="222222"/>
-                <w:sz w:val="18"/>
-                <w:szCs w:val="18"/>
-              </w:rPr>
-              <w:t xml:space="preserve">Administración central</w:t>
             </w:r>
           </w:p>
         </w:tc>
@@ -2016,7 +1924,7 @@
                 <w:sz w:val="18"/>
                 <w:szCs w:val="18"/>
               </w:rPr>
-              <w:t xml:space="preserve">Ingresar y completar antes del cierre.</w:t>
+              <w:t xml:space="preserve">Ingresar y completar.</w:t>
             </w:r>
           </w:p>
         </w:tc>
@@ -2147,7 +2055,7 @@
           <w:sz w:val="20"/>
           <w:szCs w:val="20"/>
         </w:rPr>
-        <w:t xml:space="preserve">Mientras el período de carga esté habilitado, el docente puede editar el informe de cualquier alumno de su sección. Una vez cerrado el período, el informe queda bloqueado para el docente: solo el Directivo o un rol superior puede realizar modificaciones.</w:t>
+        <w:t xml:space="preserve">El docente puede editar el informe de cualquier alumno de su sección en cualquier momento. El módulo no tiene fecha de cierre.</w:t>
       </w:r>
     </w:p>
     <w:p>
@@ -2184,7 +2092,7 @@
           <w:sz w:val="20"/>
           <w:szCs w:val="20"/>
         </w:rPr>
-        <w:t xml:space="preserve">El docente no completó el informe antes del cierre del período</w:t>
+        <w:t xml:space="preserve">El docente no completó el informe</w:t>
       </w:r>
     </w:p>
     <w:p>
@@ -2258,7 +2166,7 @@
           <w:sz w:val="20"/>
           <w:szCs w:val="20"/>
         </w:rPr>
-        <w:t xml:space="preserve">Si el período está abierto, el docente puede editar y corregir. Si ya cerró, el Directivo puede intervenir. El sistema no permite que el docente modifique un informe bloqueado por cierre de período.</w:t>
+        <w:t xml:space="preserve">El docente puede editar y corregir en cualquier momento. Si necesita apoyo, el Directivo puede intervenir.</w:t>
       </w:r>
     </w:p>
     <w:p>
@@ -3433,7 +3341,7 @@
                 <w:sz w:val="18"/>
                 <w:szCs w:val="18"/>
               </w:rPr>
-              <w:t xml:space="preserve">Primera instancia ante informes incompletos, bloqueos por cierre de período o boletines con datos incorrectos.</w:t>
+              <w:t xml:space="preserve">Primera instancia ante informes incompletos o boletines con datos incorrectos.</w:t>
             </w:r>
           </w:p>
         </w:tc>
@@ -3496,7 +3404,7 @@
                 <w:sz w:val="18"/>
                 <w:szCs w:val="18"/>
               </w:rPr>
-              <w:t xml:space="preserve">Cuando el Directivo no puede intervenir o se requiere corrección en períodos cerrados.</w:t>
+              <w:t xml:space="preserve">Cuando el Directivo no puede intervenir o se requiere corrección de datos.</w:t>
             </w:r>
           </w:p>
         </w:tc>

</xml_diff>

<commit_message>
fix: Nadia — agrega caso boletín sin informe valorativo en Manual Informes Inicial
</commit_message>
<xml_diff>
--- a/public/manuales/Manual_Informes_Inicial_2026.docx
+++ b/public/manuales/Manual_Informes_Inicial_2026.docx
@@ -3076,6 +3076,36 @@
           <w:szCs w:val="20"/>
         </w:rPr>
         <w:t xml:space="preserve">Si el período de carga sigue abierto, el docente o Directivo puede corregir y regenerar. Si ya cerró, el Directivo debe gestionar la corrección con el equipo de soporte.</w:t>
+      </w:r>
+    </w:p>
+    <w:p>
+      <w:pPr>
+        <w:spacing w:after="80" w:before="160"/>
+      </w:pPr>
+      <w:r>
+        <w:rPr>
+          <w:rFonts w:ascii="Archivo" w:cs="Archivo" w:eastAsia="Archivo" w:hAnsi="Archivo"/>
+          <w:b/>
+          <w:bCs/>
+          <w:color w:val="073244"/>
+          <w:sz w:val="20"/>
+          <w:szCs w:val="20"/>
+        </w:rPr>
+        <w:t xml:space="preserve">El boletín se generó pero el informe de un alumno no aparece</w:t>
+      </w:r>
+    </w:p>
+    <w:p>
+      <w:pPr>
+        <w:spacing w:after="60" w:before="60"/>
+      </w:pPr>
+      <w:r>
+        <w:rPr>
+          <w:rFonts w:ascii="Archivo" w:cs="Archivo" w:eastAsia="Archivo" w:hAnsi="Archivo"/>
+          <w:color w:val="222222"/>
+          <w:sz w:val="20"/>
+          <w:szCs w:val="20"/>
+        </w:rPr>
+        <w:t xml:space="preserve">Si al momento de generar los boletines algún alumno tenía el informe en estado Pendiente, ese alumno no tendrá sección de Informe Valorativo en su boletín. Para corregirlo: cargar el informe faltante y regenerar el boletín. Si el período ya cerró, el Directivo debe solicitar la intervención del equipo de soporte.</w:t>
       </w:r>
     </w:p>
     <w:p>

</xml_diff>

<commit_message>
fix: Nadia — actualiza tabla Ciclo general proceso en Manual Informes Inicial
</commit_message>
<xml_diff>
--- a/public/manuales/Manual_Informes_Inicial_2026.docx
+++ b/public/manuales/Manual_Informes_Inicial_2026.docx
@@ -823,7 +823,7 @@
                 <w:sz w:val="18"/>
                 <w:szCs w:val="18"/>
               </w:rPr>
-              <w:t xml:space="preserve">Apertura del período de carga</w:t>
+              <w:t xml:space="preserve">Apertura del período de carga (fecha por agenda educativa)</w:t>
             </w:r>
           </w:p>
         </w:tc>
@@ -1038,6 +1038,116 @@
                 <w:szCs w:val="18"/>
               </w:rPr>
               <w:t xml:space="preserve">Directivo / Vicedirector</w:t>
+            </w:r>
+          </w:p>
+        </w:tc>
+      </w:tr>
+      <w:tr>
+        <w:tc>
+          <w:tcPr>
+            <w:tcW w:type="dxa" w:w="1200"/>
+            <w:tcBorders>
+              <w:top w:val="single" w:color="CCCCCC" w:sz="1"/>
+              <w:left w:val="single" w:color="CCCCCC" w:sz="1"/>
+              <w:bottom w:val="single" w:color="CCCCCC" w:sz="1"/>
+              <w:right w:val="single" w:color="CCCCCC" w:sz="1"/>
+            </w:tcBorders>
+            <w:tcMar>
+              <w:top w:type="dxa" w:w="80"/>
+              <w:left w:type="dxa" w:w="120"/>
+              <w:bottom w:type="dxa" w:w="80"/>
+              <w:right w:type="dxa" w:w="120"/>
+            </w:tcMar>
+          </w:tcPr>
+          <w:p>
+            <w:r>
+              <w:rPr>
+                <w:rFonts w:ascii="Archivo" w:cs="Archivo" w:eastAsia="Archivo" w:hAnsi="Archivo"/>
+                <w:b/>
+                <w:bCs/>
+                <w:color w:val="222222"/>
+                <w:sz w:val="18"/>
+                <w:szCs w:val="18"/>
+              </w:rPr>
+              <w:t xml:space="preserve">4</w:t>
+            </w:r>
+          </w:p>
+        </w:tc>
+        <w:tc>
+          <w:tcPr>
+            <w:tcW w:type="dxa" w:w="3626"/>
+            <w:tcBorders>
+              <w:top w:val="single" w:color="CCCCCC" w:sz="1"/>
+              <w:left w:val="single" w:color="CCCCCC" w:sz="1"/>
+              <w:bottom w:val="single" w:color="CCCCCC" w:sz="1"/>
+              <w:right w:val="single" w:color="CCCCCC" w:sz="1"/>
+            </w:tcBorders>
+            <w:tcMar>
+              <w:top w:type="dxa" w:w="80"/>
+              <w:left w:type="dxa" w:w="120"/>
+              <w:bottom w:type="dxa" w:w="80"/>
+              <w:right w:type="dxa" w:w="120"/>
+            </w:tcMar>
+          </w:tcPr>
+          <w:p>
+            <w:r>
+              <w:rPr>
+                <w:rFonts w:ascii="Archivo" w:cs="Archivo" w:eastAsia="Archivo" w:hAnsi="Archivo"/>
+                <w:b w:val="false"/>
+                <w:bCs w:val="false"/>
+                <w:color w:val="222222"/>
+                <w:sz w:val="18"/>
+                <w:szCs w:val="18"/>
+              </w:rPr>
+              <w:t xml:space="preserve">Finalización del período de carga (fecha por agenda educativa)</w:t>
+            </w:r>
+          </w:p>
+          <w:p>
+            <w:pPr>
+              <w:spacing w:before="40"/>
+            </w:pPr>
+            <w:r>
+              <w:rPr>
+                <w:rFonts w:ascii="Archivo" w:cs="Archivo" w:eastAsia="Archivo" w:hAnsi="Archivo"/>
+                <w:b w:val="false"/>
+                <w:bCs w:val="false"/>
+                <w:color w:val="555555"/>
+                <w:sz w:val="16"/>
+                <w:szCs w:val="16"/>
+                <w:i/>
+                <w:iCs/>
+              </w:rPr>
+              <w:t xml:space="preserve">Si bien hay fecha de finalización, no hay bloqueo de carga ni de generación de boletines.</w:t>
+            </w:r>
+          </w:p>
+        </w:tc>
+        <w:tc>
+          <w:tcPr>
+            <w:tcW w:type="dxa" w:w="4200"/>
+            <w:tcBorders>
+              <w:top w:val="single" w:color="CCCCCC" w:sz="1"/>
+              <w:left w:val="single" w:color="CCCCCC" w:sz="1"/>
+              <w:bottom w:val="single" w:color="CCCCCC" w:sz="1"/>
+              <w:right w:val="single" w:color="CCCCCC" w:sz="1"/>
+            </w:tcBorders>
+            <w:tcMar>
+              <w:top w:type="dxa" w:w="80"/>
+              <w:left w:type="dxa" w:w="120"/>
+              <w:bottom w:type="dxa" w:w="80"/>
+              <w:right w:type="dxa" w:w="120"/>
+            </w:tcMar>
+          </w:tcPr>
+          <w:p>
+            <w:r>
+              <w:rPr>
+                <w:rFonts w:ascii="Archivo" w:cs="Archivo" w:eastAsia="Archivo" w:hAnsi="Archivo"/>
+                <w:b w:val="false"/>
+                <w:bCs w:val="false"/>
+                <w:color w:val="222222"/>
+                <w:sz w:val="18"/>
+                <w:szCs w:val="18"/>
+              </w:rPr>
+              <w:t xml:space="preserve">Administración central</w:t>
             </w:r>
           </w:p>
         </w:tc>

</xml_diff>

<commit_message>
fix: Nadia — corrige descarga de boletines sección 3.2 (individual desde Matriculados)
</commit_message>
<xml_diff>
--- a/public/manuales/Manual_Informes_Inicial_2026.docx
+++ b/public/manuales/Manual_Informes_Inicial_2026.docx
@@ -2960,7 +2960,7 @@
           <w:sz w:val="20"/>
           <w:szCs w:val="20"/>
         </w:rPr>
-        <w:t xml:space="preserve">El sistema compila los datos y genera un PDF por alumno. Cuando el proceso termine, aparece la opción Descargar.</w:t>
+        <w:t xml:space="preserve">El sistema compila los datos y genera un PDF por alumno.</w:t>
       </w:r>
     </w:p>
     <w:p>
@@ -2986,7 +2986,7 @@
           <w:sz w:val="20"/>
           <w:szCs w:val="20"/>
         </w:rPr>
-        <w:t xml:space="preserve">Descargar el PDF del boletín individual o el lote completo de la sección.</w:t>
+        <w:t xml:space="preserve">La descarga es individual por alumno: ingresar al módulo Matriculados, abrir el legajo del alumno y descargar el boletín desde allí.</w:t>
       </w:r>
     </w:p>
     <w:p>

</xml_diff>

<commit_message>
chore: Jesica actualiza Manual Informes Inicial 2026 (2.3 pasos, elimina tabla de estados y casos en 2.5/3.3)
</commit_message>
<xml_diff>
--- a/public/manuales/Manual_Informes_Inicial_2026.docx
+++ b/public/manuales/Manual_Informes_Inicial_2026.docx
@@ -1585,7 +1585,7 @@
           <w:sz w:val="20"/>
           <w:szCs w:val="20"/>
         </w:rPr>
-        <w:t xml:space="preserve">Hacer clic en Cargar Informe (o en el ícono de lápiz junto al alumno).</w:t>
+        <w:t xml:space="preserve">Cargar por sí o por no si el estudiante posee PPI.</w:t>
       </w:r>
     </w:p>
     <w:p>
@@ -1611,7 +1611,7 @@
           <w:sz w:val="20"/>
           <w:szCs w:val="20"/>
         </w:rPr>
-        <w:t xml:space="preserve">Se abre la pantalla del Informe Cuatrimestral con los indicadores organizados por área.</w:t>
+        <w:t xml:space="preserve">Completar, si corresponde, el área y el aspecto a fortalecer del estudiante.</w:t>
       </w:r>
     </w:p>
     <w:p>
@@ -1637,7 +1637,7 @@
           <w:sz w:val="20"/>
           <w:szCs w:val="20"/>
         </w:rPr>
-        <w:t xml:space="preserve">Seleccionar el nivel de logro para cada indicador.</w:t>
+        <w:t xml:space="preserve">Indicar qué aspecto necesita continuar trabajando.</w:t>
       </w:r>
     </w:p>
     <w:p>
@@ -1663,7 +1663,7 @@
           <w:sz w:val="20"/>
           <w:szCs w:val="20"/>
         </w:rPr>
-        <w:t xml:space="preserve">Completar el campo de Observaciones (texto libre, opcional pero recomendado).</w:t>
+        <w:t xml:space="preserve">Cargar las observaciones.</w:t>
       </w:r>
     </w:p>
     <w:p>
@@ -1689,7 +1689,33 @@
           <w:sz w:val="20"/>
           <w:szCs w:val="20"/>
         </w:rPr>
-        <w:t xml:space="preserve">Presionar Guardar. El alumno queda marcado como Completo en el listado de la sección.</w:t>
+        <w:t xml:space="preserve">Adjuntar el informe completo.</w:t>
+      </w:r>
+    </w:p>
+    <w:p>
+      <w:pPr>
+        <w:spacing w:after="60" w:before="60"/>
+        <w:ind w:left="300"/>
+      </w:pPr>
+      <w:r>
+        <w:rPr>
+          <w:rFonts w:ascii="Archivo" w:cs="Archivo" w:eastAsia="Archivo" w:hAnsi="Archivo"/>
+          <w:b/>
+          <w:bCs/>
+          <w:color w:val="073244"/>
+          <w:sz w:val="20"/>
+          <w:szCs w:val="20"/>
+        </w:rPr>
+        <w:t xml:space="preserve">7.  </w:t>
+      </w:r>
+      <w:r>
+        <w:rPr>
+          <w:rFonts w:ascii="Archivo" w:cs="Archivo" w:eastAsia="Archivo" w:hAnsi="Archivo"/>
+          <w:color w:val="222222"/>
+          <w:sz w:val="20"/>
+          <w:szCs w:val="20"/>
+        </w:rPr>
+        <w:t xml:space="preserve">Guardar y cerrar informes.</w:t>
       </w:r>
     </w:p>
     <w:p>
@@ -1735,404 +1761,23 @@
           <w:sz w:val="22"/>
           <w:szCs w:val="22"/>
         </w:rPr>
-        <w:t xml:space="preserve">2.4 Estados del informe por alumno</w:t>
-      </w:r>
-    </w:p>
-    <w:tbl>
-      <w:tblPr>
-        <w:tblW w:type="dxa" w:w="9026"/>
-        <w:tblBorders>
-          <w:top w:val="single" w:color="auto" w:sz="4"/>
-          <w:left w:val="single" w:color="auto" w:sz="4"/>
-          <w:bottom w:val="single" w:color="auto" w:sz="4"/>
-          <w:right w:val="single" w:color="auto" w:sz="4"/>
-          <w:insideH w:val="single" w:color="auto" w:sz="4"/>
-          <w:insideV w:val="single" w:color="auto" w:sz="4"/>
-        </w:tblBorders>
-      </w:tblPr>
-      <w:tblGrid>
-        <w:gridCol w:w="2200"/>
-        <w:gridCol w:w="4026"/>
-        <w:gridCol w:w="2800"/>
-      </w:tblGrid>
-      <w:tr>
-        <w:trPr>
-          <w:tblHeader/>
-        </w:trPr>
-        <w:tc>
-          <w:tcPr>
-            <w:tcW w:type="dxa" w:w="2200"/>
-            <w:tcBorders>
-              <w:top w:val="single" w:color="073244" w:sz="1"/>
-              <w:left w:val="single" w:color="073244" w:sz="1"/>
-              <w:bottom w:val="single" w:color="073244" w:sz="1"/>
-              <w:right w:val="single" w:color="073244" w:sz="1"/>
-            </w:tcBorders>
-            <w:shd w:fill="073244" w:color="auto" w:val="clear"/>
-            <w:tcMar>
-              <w:top w:type="dxa" w:w="80"/>
-              <w:left w:type="dxa" w:w="120"/>
-              <w:bottom w:type="dxa" w:w="80"/>
-              <w:right w:type="dxa" w:w="120"/>
-            </w:tcMar>
-          </w:tcPr>
-          <w:p>
-            <w:r>
-              <w:rPr>
-                <w:rFonts w:ascii="Archivo" w:cs="Archivo" w:eastAsia="Archivo" w:hAnsi="Archivo"/>
-                <w:b/>
-                <w:bCs/>
-                <w:color w:val="FFFFFF"/>
-                <w:sz w:val="18"/>
-                <w:szCs w:val="18"/>
-              </w:rPr>
-              <w:t xml:space="preserve">Estado</w:t>
-            </w:r>
-          </w:p>
-        </w:tc>
-        <w:tc>
-          <w:tcPr>
-            <w:tcW w:type="dxa" w:w="4026"/>
-            <w:tcBorders>
-              <w:top w:val="single" w:color="073244" w:sz="1"/>
-              <w:left w:val="single" w:color="073244" w:sz="1"/>
-              <w:bottom w:val="single" w:color="073244" w:sz="1"/>
-              <w:right w:val="single" w:color="073244" w:sz="1"/>
-            </w:tcBorders>
-            <w:shd w:fill="073244" w:color="auto" w:val="clear"/>
-            <w:tcMar>
-              <w:top w:type="dxa" w:w="80"/>
-              <w:left w:type="dxa" w:w="120"/>
-              <w:bottom w:type="dxa" w:w="80"/>
-              <w:right w:type="dxa" w:w="120"/>
-            </w:tcMar>
-          </w:tcPr>
-          <w:p>
-            <w:r>
-              <w:rPr>
-                <w:rFonts w:ascii="Archivo" w:cs="Archivo" w:eastAsia="Archivo" w:hAnsi="Archivo"/>
-                <w:b/>
-                <w:bCs/>
-                <w:color w:val="FFFFFF"/>
-                <w:sz w:val="18"/>
-                <w:szCs w:val="18"/>
-              </w:rPr>
-              <w:t xml:space="preserve">Qué significa</w:t>
-            </w:r>
-          </w:p>
-        </w:tc>
-        <w:tc>
-          <w:tcPr>
-            <w:tcW w:type="dxa" w:w="2800"/>
-            <w:tcBorders>
-              <w:top w:val="single" w:color="073244" w:sz="1"/>
-              <w:left w:val="single" w:color="073244" w:sz="1"/>
-              <w:bottom w:val="single" w:color="073244" w:sz="1"/>
-              <w:right w:val="single" w:color="073244" w:sz="1"/>
-            </w:tcBorders>
-            <w:shd w:fill="073244" w:color="auto" w:val="clear"/>
-            <w:tcMar>
-              <w:top w:type="dxa" w:w="80"/>
-              <w:left w:type="dxa" w:w="120"/>
-              <w:bottom w:type="dxa" w:w="80"/>
-              <w:right w:type="dxa" w:w="120"/>
-            </w:tcMar>
-          </w:tcPr>
-          <w:p>
-            <w:r>
-              <w:rPr>
-                <w:rFonts w:ascii="Archivo" w:cs="Archivo" w:eastAsia="Archivo" w:hAnsi="Archivo"/>
-                <w:b/>
-                <w:bCs/>
-                <w:color w:val="FFFFFF"/>
-                <w:sz w:val="18"/>
-                <w:szCs w:val="18"/>
-              </w:rPr>
-              <w:t xml:space="preserve">Acción sugerida</w:t>
-            </w:r>
-          </w:p>
-        </w:tc>
-      </w:tr>
-      <w:tr>
-        <w:tc>
-          <w:tcPr>
-            <w:tcW w:type="dxa" w:w="2200"/>
-            <w:tcBorders>
-              <w:top w:val="single" w:color="CCCCCC" w:sz="1"/>
-              <w:left w:val="single" w:color="CCCCCC" w:sz="1"/>
-              <w:bottom w:val="single" w:color="CCCCCC" w:sz="1"/>
-              <w:right w:val="single" w:color="CCCCCC" w:sz="1"/>
-            </w:tcBorders>
-            <w:shd w:fill="E8F5E9" w:color="auto" w:val="clear"/>
-            <w:tcMar>
-              <w:top w:type="dxa" w:w="80"/>
-              <w:left w:type="dxa" w:w="120"/>
-              <w:bottom w:type="dxa" w:w="80"/>
-              <w:right w:type="dxa" w:w="120"/>
-            </w:tcMar>
-          </w:tcPr>
-          <w:p>
-            <w:r>
-              <w:rPr>
-                <w:rFonts w:ascii="Archivo" w:cs="Archivo" w:eastAsia="Archivo" w:hAnsi="Archivo"/>
-                <w:b w:val="false"/>
-                <w:bCs w:val="false"/>
-                <w:color w:val="222222"/>
-                <w:sz w:val="18"/>
-                <w:szCs w:val="18"/>
-              </w:rPr>
-              <w:t xml:space="preserve">Completo</w:t>
-            </w:r>
-          </w:p>
-        </w:tc>
-        <w:tc>
-          <w:tcPr>
-            <w:tcW w:type="dxa" w:w="4026"/>
-            <w:tcBorders>
-              <w:top w:val="single" w:color="CCCCCC" w:sz="1"/>
-              <w:left w:val="single" w:color="CCCCCC" w:sz="1"/>
-              <w:bottom w:val="single" w:color="CCCCCC" w:sz="1"/>
-              <w:right w:val="single" w:color="CCCCCC" w:sz="1"/>
-            </w:tcBorders>
-            <w:tcMar>
-              <w:top w:type="dxa" w:w="80"/>
-              <w:left w:type="dxa" w:w="120"/>
-              <w:bottom w:type="dxa" w:w="80"/>
-              <w:right w:type="dxa" w:w="120"/>
-            </w:tcMar>
-          </w:tcPr>
-          <w:p>
-            <w:r>
-              <w:rPr>
-                <w:rFonts w:ascii="Archivo" w:cs="Archivo" w:eastAsia="Archivo" w:hAnsi="Archivo"/>
-                <w:b w:val="false"/>
-                <w:bCs w:val="false"/>
-                <w:color w:val="222222"/>
-                <w:sz w:val="18"/>
-                <w:szCs w:val="18"/>
-              </w:rPr>
-              <w:t xml:space="preserve">El informe fue cargado y guardado correctamente.</w:t>
-            </w:r>
-          </w:p>
-        </w:tc>
-        <w:tc>
-          <w:tcPr>
-            <w:tcW w:type="dxa" w:w="2800"/>
-            <w:tcBorders>
-              <w:top w:val="single" w:color="CCCCCC" w:sz="1"/>
-              <w:left w:val="single" w:color="CCCCCC" w:sz="1"/>
-              <w:bottom w:val="single" w:color="CCCCCC" w:sz="1"/>
-              <w:right w:val="single" w:color="CCCCCC" w:sz="1"/>
-            </w:tcBorders>
-            <w:tcMar>
-              <w:top w:type="dxa" w:w="80"/>
-              <w:left w:type="dxa" w:w="120"/>
-              <w:bottom w:type="dxa" w:w="80"/>
-              <w:right w:type="dxa" w:w="120"/>
-            </w:tcMar>
-          </w:tcPr>
-          <w:p>
-            <w:r>
-              <w:rPr>
-                <w:rFonts w:ascii="Archivo" w:cs="Archivo" w:eastAsia="Archivo" w:hAnsi="Archivo"/>
-                <w:b w:val="false"/>
-                <w:bCs w:val="false"/>
-                <w:color w:val="222222"/>
-                <w:sz w:val="18"/>
-                <w:szCs w:val="18"/>
-              </w:rPr>
-              <w:t xml:space="preserve">Ninguna — listo para boletín.</w:t>
-            </w:r>
-          </w:p>
-        </w:tc>
-      </w:tr>
-      <w:tr>
-        <w:tc>
-          <w:tcPr>
-            <w:tcW w:type="dxa" w:w="2200"/>
-            <w:tcBorders>
-              <w:top w:val="single" w:color="CCCCCC" w:sz="1"/>
-              <w:left w:val="single" w:color="CCCCCC" w:sz="1"/>
-              <w:bottom w:val="single" w:color="CCCCCC" w:sz="1"/>
-              <w:right w:val="single" w:color="CCCCCC" w:sz="1"/>
-            </w:tcBorders>
-            <w:shd w:fill="FFF3E0" w:color="auto" w:val="clear"/>
-            <w:tcMar>
-              <w:top w:type="dxa" w:w="80"/>
-              <w:left w:type="dxa" w:w="120"/>
-              <w:bottom w:type="dxa" w:w="80"/>
-              <w:right w:type="dxa" w:w="120"/>
-            </w:tcMar>
-          </w:tcPr>
-          <w:p>
-            <w:r>
-              <w:rPr>
-                <w:rFonts w:ascii="Archivo" w:cs="Archivo" w:eastAsia="Archivo" w:hAnsi="Archivo"/>
-                <w:b w:val="false"/>
-                <w:bCs w:val="false"/>
-                <w:color w:val="222222"/>
-                <w:sz w:val="18"/>
-                <w:szCs w:val="18"/>
-              </w:rPr>
-              <w:t xml:space="preserve">Pendiente</w:t>
-            </w:r>
-          </w:p>
-        </w:tc>
-        <w:tc>
-          <w:tcPr>
-            <w:tcW w:type="dxa" w:w="4026"/>
-            <w:tcBorders>
-              <w:top w:val="single" w:color="CCCCCC" w:sz="1"/>
-              <w:left w:val="single" w:color="CCCCCC" w:sz="1"/>
-              <w:bottom w:val="single" w:color="CCCCCC" w:sz="1"/>
-              <w:right w:val="single" w:color="CCCCCC" w:sz="1"/>
-            </w:tcBorders>
-            <w:tcMar>
-              <w:top w:type="dxa" w:w="80"/>
-              <w:left w:type="dxa" w:w="120"/>
-              <w:bottom w:type="dxa" w:w="80"/>
-              <w:right w:type="dxa" w:w="120"/>
-            </w:tcMar>
-          </w:tcPr>
-          <w:p>
-            <w:r>
-              <w:rPr>
-                <w:rFonts w:ascii="Archivo" w:cs="Archivo" w:eastAsia="Archivo" w:hAnsi="Archivo"/>
-                <w:b w:val="false"/>
-                <w:bCs w:val="false"/>
-                <w:color w:val="222222"/>
-                <w:sz w:val="18"/>
-                <w:szCs w:val="18"/>
-              </w:rPr>
-              <w:t xml:space="preserve">El informe no fue iniciado o no fue guardado.</w:t>
-            </w:r>
-          </w:p>
-        </w:tc>
-        <w:tc>
-          <w:tcPr>
-            <w:tcW w:type="dxa" w:w="2800"/>
-            <w:tcBorders>
-              <w:top w:val="single" w:color="CCCCCC" w:sz="1"/>
-              <w:left w:val="single" w:color="CCCCCC" w:sz="1"/>
-              <w:bottom w:val="single" w:color="CCCCCC" w:sz="1"/>
-              <w:right w:val="single" w:color="CCCCCC" w:sz="1"/>
-            </w:tcBorders>
-            <w:tcMar>
-              <w:top w:type="dxa" w:w="80"/>
-              <w:left w:type="dxa" w:w="120"/>
-              <w:bottom w:type="dxa" w:w="80"/>
-              <w:right w:type="dxa" w:w="120"/>
-            </w:tcMar>
-          </w:tcPr>
-          <w:p>
-            <w:r>
-              <w:rPr>
-                <w:rFonts w:ascii="Archivo" w:cs="Archivo" w:eastAsia="Archivo" w:hAnsi="Archivo"/>
-                <w:b w:val="false"/>
-                <w:bCs w:val="false"/>
-                <w:color w:val="222222"/>
-                <w:sz w:val="18"/>
-                <w:szCs w:val="18"/>
-              </w:rPr>
-              <w:t xml:space="preserve">Ingresar y completar.</w:t>
-            </w:r>
-          </w:p>
-        </w:tc>
-      </w:tr>
-      <w:tr>
-        <w:tc>
-          <w:tcPr>
-            <w:tcW w:type="dxa" w:w="2200"/>
-            <w:tcBorders>
-              <w:top w:val="single" w:color="CCCCCC" w:sz="1"/>
-              <w:left w:val="single" w:color="CCCCCC" w:sz="1"/>
-              <w:bottom w:val="single" w:color="CCCCCC" w:sz="1"/>
-              <w:right w:val="single" w:color="CCCCCC" w:sz="1"/>
-            </w:tcBorders>
-            <w:shd w:fill="E3F2FD" w:color="auto" w:val="clear"/>
-            <w:tcMar>
-              <w:top w:type="dxa" w:w="80"/>
-              <w:left w:type="dxa" w:w="120"/>
-              <w:bottom w:type="dxa" w:w="80"/>
-              <w:right w:type="dxa" w:w="120"/>
-            </w:tcMar>
-          </w:tcPr>
-          <w:p>
-            <w:r>
-              <w:rPr>
-                <w:rFonts w:ascii="Archivo" w:cs="Archivo" w:eastAsia="Archivo" w:hAnsi="Archivo"/>
-                <w:b w:val="false"/>
-                <w:bCs w:val="false"/>
-                <w:color w:val="222222"/>
-                <w:sz w:val="18"/>
-                <w:szCs w:val="18"/>
-              </w:rPr>
-              <w:t xml:space="preserve">En edición</w:t>
-            </w:r>
-          </w:p>
-        </w:tc>
-        <w:tc>
-          <w:tcPr>
-            <w:tcW w:type="dxa" w:w="4026"/>
-            <w:tcBorders>
-              <w:top w:val="single" w:color="CCCCCC" w:sz="1"/>
-              <w:left w:val="single" w:color="CCCCCC" w:sz="1"/>
-              <w:bottom w:val="single" w:color="CCCCCC" w:sz="1"/>
-              <w:right w:val="single" w:color="CCCCCC" w:sz="1"/>
-            </w:tcBorders>
-            <w:tcMar>
-              <w:top w:type="dxa" w:w="80"/>
-              <w:left w:type="dxa" w:w="120"/>
-              <w:bottom w:type="dxa" w:w="80"/>
-              <w:right w:type="dxa" w:w="120"/>
-            </w:tcMar>
-          </w:tcPr>
-          <w:p>
-            <w:r>
-              <w:rPr>
-                <w:rFonts w:ascii="Archivo" w:cs="Archivo" w:eastAsia="Archivo" w:hAnsi="Archivo"/>
-                <w:b w:val="false"/>
-                <w:bCs w:val="false"/>
-                <w:color w:val="222222"/>
-                <w:sz w:val="18"/>
-                <w:szCs w:val="18"/>
-              </w:rPr>
-              <w:t xml:space="preserve">Fue iniciado pero no guardado.</w:t>
-            </w:r>
-          </w:p>
-        </w:tc>
-        <w:tc>
-          <w:tcPr>
-            <w:tcW w:type="dxa" w:w="2800"/>
-            <w:tcBorders>
-              <w:top w:val="single" w:color="CCCCCC" w:sz="1"/>
-              <w:left w:val="single" w:color="CCCCCC" w:sz="1"/>
-              <w:bottom w:val="single" w:color="CCCCCC" w:sz="1"/>
-              <w:right w:val="single" w:color="CCCCCC" w:sz="1"/>
-            </w:tcBorders>
-            <w:tcMar>
-              <w:top w:type="dxa" w:w="80"/>
-              <w:left w:type="dxa" w:w="120"/>
-              <w:bottom w:type="dxa" w:w="80"/>
-              <w:right w:type="dxa" w:w="120"/>
-            </w:tcMar>
-          </w:tcPr>
-          <w:p>
-            <w:r>
-              <w:rPr>
-                <w:rFonts w:ascii="Archivo" w:cs="Archivo" w:eastAsia="Archivo" w:hAnsi="Archivo"/>
-                <w:b w:val="false"/>
-                <w:bCs w:val="false"/>
-                <w:color w:val="222222"/>
-                <w:sz w:val="18"/>
-                <w:szCs w:val="18"/>
-              </w:rPr>
-              <w:t xml:space="preserve">Completar y guardar.</w:t>
-            </w:r>
-          </w:p>
-        </w:tc>
-      </w:tr>
-    </w:tbl>
+        <w:t xml:space="preserve">2.4 Edición y corrección del informe</w:t>
+      </w:r>
+    </w:p>
+    <w:p>
+      <w:pPr>
+        <w:spacing w:after="60" w:before="60"/>
+      </w:pPr>
+      <w:r>
+        <w:rPr>
+          <w:rFonts w:ascii="Archivo" w:cs="Archivo" w:eastAsia="Archivo" w:hAnsi="Archivo"/>
+          <w:color w:val="222222"/>
+          <w:sz w:val="20"/>
+          <w:szCs w:val="20"/>
+        </w:rPr>
+        <w:t xml:space="preserve">El docente puede editar el informe de cualquier alumno de su sección en cualquier momento. El módulo no tiene fecha de cierre.</w:t>
+      </w:r>
+    </w:p>
     <w:p>
       <w:r>
         <w:t xml:space="preserve"/>
@@ -2151,7 +1796,23 @@
           <w:sz w:val="22"/>
           <w:szCs w:val="22"/>
         </w:rPr>
-        <w:t xml:space="preserve">2.5 Edición y corrección del informe</w:t>
+        <w:t xml:space="preserve">2.5 Casos frecuentes</w:t>
+      </w:r>
+    </w:p>
+    <w:p>
+      <w:pPr>
+        <w:spacing w:after="80" w:before="160"/>
+      </w:pPr>
+      <w:r>
+        <w:rPr>
+          <w:rFonts w:ascii="Archivo" w:cs="Archivo" w:eastAsia="Archivo" w:hAnsi="Archivo"/>
+          <w:b/>
+          <w:bCs/>
+          <w:color w:val="073244"/>
+          <w:sz w:val="20"/>
+          <w:szCs w:val="20"/>
+        </w:rPr>
+        <w:t xml:space="preserve">El docente no completó el informe</w:t>
       </w:r>
     </w:p>
     <w:p>
@@ -2165,28 +1826,7 @@
           <w:sz w:val="20"/>
           <w:szCs w:val="20"/>
         </w:rPr>
-        <w:t xml:space="preserve">El docente puede editar el informe de cualquier alumno de su sección en cualquier momento. El módulo no tiene fecha de cierre.</w:t>
-      </w:r>
-    </w:p>
-    <w:p>
-      <w:r>
-        <w:t xml:space="preserve"/>
-      </w:r>
-    </w:p>
-    <w:p>
-      <w:pPr>
-        <w:spacing w:after="100" w:before="220"/>
-      </w:pPr>
-      <w:r>
-        <w:rPr>
-          <w:rFonts w:ascii="Archivo" w:cs="Archivo" w:eastAsia="Archivo" w:hAnsi="Archivo"/>
-          <w:b/>
-          <w:bCs/>
-          <w:color w:val="0D6B5E"/>
-          <w:sz w:val="22"/>
-          <w:szCs w:val="22"/>
-        </w:rPr>
-        <w:t xml:space="preserve">2.6 Casos frecuentes</w:t>
+        <w:t xml:space="preserve">El Directivo tiene habilitado el acceso para completar o modificar informes en estado pendiente. Si el Directivo tampoco puede intervenir, el caso debe elevarse al equipo de soporte de AprendeBA.</w:t>
       </w:r>
     </w:p>
     <w:p>
@@ -2202,7 +1842,7 @@
           <w:sz w:val="20"/>
           <w:szCs w:val="20"/>
         </w:rPr>
-        <w:t xml:space="preserve">El docente no completó el informe</w:t>
+        <w:t xml:space="preserve">El alumno no aparece en el listado</w:t>
       </w:r>
     </w:p>
     <w:p>
@@ -2216,37 +1856,7 @@
           <w:sz w:val="20"/>
           <w:szCs w:val="20"/>
         </w:rPr>
-        <w:t xml:space="preserve">El Directivo tiene habilitado el acceso para completar o modificar informes en estado pendiente. Si el Directivo tampoco puede intervenir, el caso debe elevarse al equipo de soporte de AprendeBA.</w:t>
-      </w:r>
-    </w:p>
-    <w:p>
-      <w:pPr>
-        <w:spacing w:after="80" w:before="160"/>
-      </w:pPr>
-      <w:r>
-        <w:rPr>
-          <w:rFonts w:ascii="Archivo" w:cs="Archivo" w:eastAsia="Archivo" w:hAnsi="Archivo"/>
-          <w:b/>
-          <w:bCs/>
-          <w:color w:val="073244"/>
-          <w:sz w:val="20"/>
-          <w:szCs w:val="20"/>
-        </w:rPr>
-        <w:t xml:space="preserve">El alumno no aparece en el listado</w:t>
-      </w:r>
-    </w:p>
-    <w:p>
-      <w:pPr>
-        <w:spacing w:after="60" w:before="60"/>
-      </w:pPr>
-      <w:r>
-        <w:rPr>
-          <w:rFonts w:ascii="Archivo" w:cs="Archivo" w:eastAsia="Archivo" w:hAnsi="Archivo"/>
-          <w:color w:val="222222"/>
-          <w:sz w:val="20"/>
-          <w:szCs w:val="20"/>
-        </w:rPr>
-        <w:t xml:space="preserve">Si el estudiante fue matriculado (FEM activa) durante o después del período de informes, puede no aparecer. Verificar que la matrícula esté efectivizada. Si el alumno aparece pero con un período incorrecto, reportarlo a soporte para ajustar la configuración.</w:t>
+        <w:t xml:space="preserve">Si el estudiante fue matriculado (FEM activa) durante o después del período de informes, puede no aparecer. Verificar que la matrícula esté efectivizada.</w:t>
       </w:r>
     </w:p>
     <w:p>
@@ -3058,74 +2668,6 @@
           <w:szCs w:val="20"/>
         </w:rPr>
         <w:t xml:space="preserve">Completar todos los informes primero. Solo cuando la sección está en 100% Completo el botón de generación se activa.</w:t>
-      </w:r>
-    </w:p>
-    <w:p>
-      <w:pPr>
-        <w:spacing w:after="80" w:before="160"/>
-      </w:pPr>
-      <w:r>
-        <w:rPr>
-          <w:rFonts w:ascii="Archivo" w:cs="Archivo" w:eastAsia="Archivo" w:hAnsi="Archivo"/>
-          <w:b/>
-          <w:bCs/>
-          <w:color w:val="073244"/>
-          <w:sz w:val="20"/>
-          <w:szCs w:val="20"/>
-        </w:rPr>
-        <w:t xml:space="preserve">El presentismo está incompleto</w:t>
-      </w:r>
-    </w:p>
-    <w:p>
-      <w:pPr>
-        <w:spacing w:after="60" w:before="60"/>
-        <w:ind w:left="300"/>
-      </w:pPr>
-      <w:r>
-        <w:rPr>
-          <w:rFonts w:ascii="Archivo" w:cs="Archivo" w:eastAsia="Archivo" w:hAnsi="Archivo"/>
-          <w:b/>
-          <w:bCs/>
-          <w:color w:val="073244"/>
-          <w:sz w:val="20"/>
-          <w:szCs w:val="20"/>
-        </w:rPr>
-        <w:t xml:space="preserve">1.  </w:t>
-      </w:r>
-      <w:r>
-        <w:rPr>
-          <w:rFonts w:ascii="Archivo" w:cs="Archivo" w:eastAsia="Archivo" w:hAnsi="Archivo"/>
-          <w:color w:val="222222"/>
-          <w:sz w:val="20"/>
-          <w:szCs w:val="20"/>
-        </w:rPr>
-        <w:t xml:space="preserve">Completar y corregir el presentismo en el módulo correspondiente.</w:t>
-      </w:r>
-    </w:p>
-    <w:p>
-      <w:pPr>
-        <w:spacing w:after="60" w:before="60"/>
-        <w:ind w:left="300"/>
-      </w:pPr>
-      <w:r>
-        <w:rPr>
-          <w:rFonts w:ascii="Archivo" w:cs="Archivo" w:eastAsia="Archivo" w:hAnsi="Archivo"/>
-          <w:b/>
-          <w:bCs/>
-          <w:color w:val="073244"/>
-          <w:sz w:val="20"/>
-          <w:szCs w:val="20"/>
-        </w:rPr>
-        <w:t xml:space="preserve">2.  </w:t>
-      </w:r>
-      <w:r>
-        <w:rPr>
-          <w:rFonts w:ascii="Archivo" w:cs="Archivo" w:eastAsia="Archivo" w:hAnsi="Archivo"/>
-          <w:color w:val="222222"/>
-          <w:sz w:val="20"/>
-          <w:szCs w:val="20"/>
-        </w:rPr>
-        <w:t xml:space="preserve">Volver al módulo de Informes y volver a generar.</w:t>
       </w:r>
     </w:p>
     <w:p>

</xml_diff>